<commit_message>
docs: regenerate ABNT report with proper Portuguese accents (Sprint 03)
Co-Authored-By: Devin AI <158243242+devin-ai-integration[bot]@users.noreply.github.com>
</commit_message>
<xml_diff>
--- a/level-up-wokwi/Relatorio_Logica_Digital_Sprint03_ABNT.docx
+++ b/level-up-wokwi/Relatorio_Logica_Digital_Sprint03_ABNT.docx
@@ -17,7 +17,7 @@
           <w:b/>
           <w:sz w:val="28"/>
         </w:rPr>
-        <w:t>FIAP - FACULDADE DE INFORMATICA E ADMINISTRACAO PAULISTA</w:t>
+        <w:t>FIAP - FACULDADE DE INFORMÁTICA E ADMINISTRAÇÃO PAULISTA</w:t>
       </w:r>
     </w:p>
     <w:p>
@@ -47,7 +47,7 @@
           <w:b/>
           <w:sz w:val="32"/>
         </w:rPr>
-        <w:t>RELATORIO DE LOGICA DIGITAL</w:t>
+        <w:t>RELATÓRIO DE LÓGICA DIGITAL</w:t>
       </w:r>
     </w:p>
     <w:p>
@@ -89,7 +89,7 @@
           <w:b w:val="0"/>
           <w:sz w:val="28"/>
         </w:rPr>
-        <w:t>Monitoramento de Saude</w:t>
+        <w:t>Monitoramento de Saúde</w:t>
       </w:r>
     </w:p>
     <w:p/>
@@ -106,7 +106,7 @@
           <w:b w:val="0"/>
           <w:sz w:val="24"/>
         </w:rPr>
-        <w:t>Nicolas Araujo de Oliveira - RM 566780</w:t>
+        <w:t>Nicolas Araújo de Oliveira - RM 566780</w:t>
       </w:r>
     </w:p>
     <w:p>
@@ -120,7 +120,7 @@
           <w:b w:val="0"/>
           <w:sz w:val="24"/>
         </w:rPr>
-        <w:t>Pedro Ivson Falcao De Leucas</w:t>
+        <w:t>Pedro Ivson Falcão De Leucas</w:t>
       </w:r>
     </w:p>
     <w:p>
@@ -150,7 +150,7 @@
           <w:b w:val="0"/>
           <w:sz w:val="24"/>
         </w:rPr>
-        <w:t>Sao Paulo</w:t>
+        <w:t>São Paulo</w:t>
       </w:r>
     </w:p>
     <w:p>
@@ -183,7 +183,7 @@
           <w:b/>
           <w:sz w:val="28"/>
         </w:rPr>
-        <w:t>SUMARIO</w:t>
+        <w:t>SUMÁRIO</w:t>
       </w:r>
     </w:p>
     <w:p>
@@ -196,7 +196,7 @@
           <w:b/>
           <w:sz w:val="24"/>
         </w:rPr>
-        <w:t>1  INTRODUCAO</w:t>
+        <w:t>1  INTRODUÇÃO</w:t>
       </w:r>
       <w:r>
         <w:rPr>
@@ -216,7 +216,7 @@
           <w:b/>
           <w:sz w:val="24"/>
         </w:rPr>
-        <w:t>2  SISTEMA DE ALERTAS DE SAUDE (LEDS + BUZZER)</w:t>
+        <w:t>2  SISTEMA DE ALERTAS DE SAÚDE (LEDS + BUZZER)</w:t>
       </w:r>
       <w:r>
         <w:rPr>
@@ -235,7 +235,7 @@
           <w:rFonts w:ascii="Times New Roman" w:hAnsi="Times New Roman"/>
           <w:sz w:val="24"/>
         </w:rPr>
-        <w:t xml:space="preserve">  2.1  Descricao do Funcionamento</w:t>
+        <w:t xml:space="preserve">  2.1  Descrição do Funcionamento</w:t>
       </w:r>
       <w:r>
         <w:rPr>
@@ -254,7 +254,7 @@
           <w:rFonts w:ascii="Times New Roman" w:hAnsi="Times New Roman"/>
           <w:sz w:val="24"/>
         </w:rPr>
-        <w:t xml:space="preserve">  2.2  Variaveis Booleanas de Entrada</w:t>
+        <w:t xml:space="preserve">  2.2  Variáveis Booleanas de Entrada</w:t>
       </w:r>
       <w:r>
         <w:rPr>
@@ -273,7 +273,7 @@
           <w:rFonts w:ascii="Times New Roman" w:hAnsi="Times New Roman"/>
           <w:sz w:val="24"/>
         </w:rPr>
-        <w:t xml:space="preserve">  2.3  Saidas do Sistema</w:t>
+        <w:t xml:space="preserve">  2.3  Saídas do Sistema</w:t>
       </w:r>
       <w:r>
         <w:rPr>
@@ -292,7 +292,7 @@
           <w:rFonts w:ascii="Times New Roman" w:hAnsi="Times New Roman"/>
           <w:sz w:val="24"/>
         </w:rPr>
-        <w:t xml:space="preserve">  2.4  Expressoes Logicas Originais</w:t>
+        <w:t xml:space="preserve">  2.4  Expressões Lógicas Originais</w:t>
       </w:r>
       <w:r>
         <w:rPr>
@@ -330,7 +330,7 @@
           <w:rFonts w:ascii="Times New Roman" w:hAnsi="Times New Roman"/>
           <w:sz w:val="24"/>
         </w:rPr>
-        <w:t xml:space="preserve">  2.6  Simplificacao por Algebra Booleana</w:t>
+        <w:t xml:space="preserve">  2.6  Simplificação por Álgebra Booleana</w:t>
       </w:r>
       <w:r>
         <w:rPr>
@@ -368,7 +368,7 @@
           <w:rFonts w:ascii="Times New Roman" w:hAnsi="Times New Roman"/>
           <w:sz w:val="24"/>
         </w:rPr>
-        <w:t xml:space="preserve">  2.8  Expressoes Simplificadas</w:t>
+        <w:t xml:space="preserve">  2.8  Expressões Simplificadas</w:t>
       </w:r>
       <w:r>
         <w:rPr>
@@ -387,7 +387,7 @@
           <w:rFonts w:ascii="Times New Roman" w:hAnsi="Times New Roman"/>
           <w:sz w:val="24"/>
         </w:rPr>
-        <w:t xml:space="preserve">  2.9  Diagramas Logicos</w:t>
+        <w:t xml:space="preserve">  2.9  Diagramas Lógicos</w:t>
       </w:r>
       <w:r>
         <w:rPr>
@@ -426,7 +426,7 @@
           <w:b/>
           <w:sz w:val="24"/>
         </w:rPr>
-        <w:t>3  SISTEMA DE GAMIFICACAO (PONTOS)</w:t>
+        <w:t>3  SISTEMA DE GAMIFICAÇÃO (PONTOS)</w:t>
       </w:r>
       <w:r>
         <w:rPr>
@@ -445,7 +445,7 @@
           <w:rFonts w:ascii="Times New Roman" w:hAnsi="Times New Roman"/>
           <w:sz w:val="24"/>
         </w:rPr>
-        <w:t xml:space="preserve">  3.1  Descricao e Variaveis</w:t>
+        <w:t xml:space="preserve">  3.1  Descrição e Variáveis</w:t>
       </w:r>
       <w:r>
         <w:rPr>
@@ -464,7 +464,7 @@
           <w:rFonts w:ascii="Times New Roman" w:hAnsi="Times New Roman"/>
           <w:sz w:val="24"/>
         </w:rPr>
-        <w:t xml:space="preserve">  3.2  Simplificacao</w:t>
+        <w:t xml:space="preserve">  3.2  Simplificação</w:t>
       </w:r>
       <w:r>
         <w:rPr>
@@ -483,7 +483,7 @@
           <w:rFonts w:ascii="Times New Roman" w:hAnsi="Times New Roman"/>
           <w:sz w:val="24"/>
         </w:rPr>
-        <w:t xml:space="preserve">  3.3  Prova de Equivalencia</w:t>
+        <w:t xml:space="preserve">  3.3  Prova de Equivalência</w:t>
       </w:r>
       <w:r>
         <w:rPr>
@@ -503,7 +503,7 @@
           <w:b/>
           <w:sz w:val="24"/>
         </w:rPr>
-        <w:t>4  SISTEMA DE CLASSIFICACAO DE RISCO</w:t>
+        <w:t>4  SISTEMA DE CLASSIFICAÇÃO DE RISCO</w:t>
       </w:r>
       <w:r>
         <w:rPr>
@@ -522,7 +522,7 @@
           <w:rFonts w:ascii="Times New Roman" w:hAnsi="Times New Roman"/>
           <w:sz w:val="24"/>
         </w:rPr>
-        <w:t xml:space="preserve">  4.1  Descricao e Variaveis</w:t>
+        <w:t xml:space="preserve">  4.1  Descrição e Variáveis</w:t>
       </w:r>
       <w:r>
         <w:rPr>
@@ -541,7 +541,7 @@
           <w:rFonts w:ascii="Times New Roman" w:hAnsi="Times New Roman"/>
           <w:sz w:val="24"/>
         </w:rPr>
-        <w:t xml:space="preserve">  4.2  Simplificacao</w:t>
+        <w:t xml:space="preserve">  4.2  Simplificação</w:t>
       </w:r>
       <w:r>
         <w:rPr>
@@ -560,7 +560,7 @@
           <w:rFonts w:ascii="Times New Roman" w:hAnsi="Times New Roman"/>
           <w:sz w:val="24"/>
         </w:rPr>
-        <w:t xml:space="preserve">  4.3  Prova de Equivalencia</w:t>
+        <w:t xml:space="preserve">  4.3  Prova de Equivalência</w:t>
       </w:r>
       <w:r>
         <w:rPr>
@@ -580,7 +580,7 @@
           <w:b/>
           <w:sz w:val="24"/>
         </w:rPr>
-        <w:t>5  RESUMO DAS SIMPLIFICACOES</w:t>
+        <w:t>5  RESUMO DAS SIMPLIFICAÇÕES</w:t>
       </w:r>
       <w:r>
         <w:rPr>
@@ -600,7 +600,7 @@
           <w:b/>
           <w:sz w:val="24"/>
         </w:rPr>
-        <w:t>6  CONCLUSAO</w:t>
+        <w:t>6  CONCLUSÃO</w:t>
       </w:r>
       <w:r>
         <w:rPr>
@@ -620,7 +620,7 @@
           <w:b/>
           <w:sz w:val="24"/>
         </w:rPr>
-        <w:t>REFERENCIAS</w:t>
+        <w:t>REFERÊNCIAS</w:t>
       </w:r>
       <w:r>
         <w:rPr>
@@ -640,7 +640,7 @@
         <w:pStyle w:val="Heading1"/>
       </w:pPr>
       <w:r>
-        <w:t>1  INTRODUCAO</w:t>
+        <w:t>1  INTRODUÇÃO</w:t>
       </w:r>
     </w:p>
     <w:p>
@@ -655,7 +655,7 @@
           <w:b w:val="0"/>
           <w:sz w:val="24"/>
         </w:rPr>
-        <w:t>Este relatorio apresenta a modelagem e simplificacao da logica digital do sistema Level UP, um monitor inteligente de saude baseado em ESP32 simulado na plataforma Wokwi. O trabalho atende aos requisitos da Sprint 03, aplicando conceitos de logica digital ao projeto em desenvolvimento.</w:t>
+        <w:t>Este relatório apresenta a modelagem e simplificação da lógica digital do sistema Level UP, um monitor inteligente de saúde baseado em ESP32 simulado na plataforma Wokwi. O trabalho atende aos requisitos da Sprint 03, aplicando conceitos de lógica digital ao projeto em desenvolvimento.</w:t>
       </w:r>
     </w:p>
     <w:p>
@@ -670,7 +670,7 @@
           <w:b w:val="0"/>
           <w:sz w:val="24"/>
         </w:rPr>
-        <w:t>O sistema Level UP possui tres subsistemas principais com logica digital bem definida, que serao analisados neste relatorio:</w:t>
+        <w:t>O sistema Level UP possui três subsistemas principais com lógica digital bem definida, que serão analisados neste relatório:</w:t>
       </w:r>
     </w:p>
     <w:p>
@@ -683,7 +683,7 @@
           <w:rFonts w:ascii="Times New Roman" w:hAnsi="Times New Roman"/>
           <w:sz w:val="24"/>
         </w:rPr>
-        <w:t>• Sistema de Alertas de Saude - controla LEDs (verde, amarelo e vermelho) e buzzer com base em faixas de frequencia cardiaca e temperatura corporal;</w:t>
+        <w:t>• Sistema de Alertas de Saúde — controla LEDs (verde, amarelo e vermelho) e buzzer com base em faixas de frequência cardíaca e temperatura corporal;</w:t>
       </w:r>
     </w:p>
     <w:p>
@@ -696,7 +696,7 @@
           <w:rFonts w:ascii="Times New Roman" w:hAnsi="Times New Roman"/>
           <w:sz w:val="24"/>
         </w:rPr>
-        <w:t>• Sistema de Gamificacao - determina se o paciente ganha pontos com base em indicadores de saude saudaveis;</w:t>
+        <w:t>• Sistema de Gamificação — determina se o paciente ganha pontos com base em indicadores de saúde saudáveis;</w:t>
       </w:r>
     </w:p>
     <w:p>
@@ -709,7 +709,7 @@
           <w:rFonts w:ascii="Times New Roman" w:hAnsi="Times New Roman"/>
           <w:sz w:val="24"/>
         </w:rPr>
-        <w:t>• Sistema de Classificacao de Risco - classifica o resultado do check-up digital em tres niveis de risco (baixo, moderado e alto).</w:t>
+        <w:t>• Sistema de Classificação de Risco — classifica o resultado do check-up digital em três níveis de risco (baixo, moderado e alto).</w:t>
       </w:r>
     </w:p>
     <w:p>
@@ -724,7 +724,7 @@
           <w:b w:val="0"/>
           <w:sz w:val="24"/>
         </w:rPr>
-        <w:t>Para cada subsistema, iremos: (a) modelar as expressoes booleanas originais extraidas diretamente do codigo-fonte; (b) aplicar tecnicas de simplificacao utilizando algebra booleana e mapas de Karnaugh; e (c) provar a equivalencia entre os modelos original e simplificado por meio de tabelas verdade comparativas.</w:t>
+        <w:t>Para cada subsistema, iremos: (a) modelar as expressões booleanas originais extraídas diretamente do código-fonte; (b) aplicar técnicas de simplificação utilizando álgebra booleana e mapas de Karnaugh; e (c) provar a equivalência entre os modelos original e simplificado por meio de tabelas verdade comparativas.</w:t>
       </w:r>
     </w:p>
     <w:p>
@@ -739,7 +739,7 @@
           <w:b w:val="0"/>
           <w:sz w:val="24"/>
         </w:rPr>
-        <w:t>O codigo-fonte analisado encontra-se no arquivo sketch.ino do projeto, desenvolvido em linguagem C/C++ para a plataforma Arduino (ESP32). As expressoes booleanas foram extraidas das funcoes evaluateHealth(), awardPoints() e calculateRiskScore().</w:t>
+        <w:t>O código-fonte analisado encontra-se no arquivo sketch.ino do projeto, desenvolvido em linguagem C/C++ para a plataforma Arduino (ESP32). As expressões booleanas foram extraídas das funções evaluateHealth(), awardPoints() e calculateRiskScore().</w:t>
       </w:r>
     </w:p>
     <w:p>
@@ -752,7 +752,7 @@
         <w:pStyle w:val="Heading1"/>
       </w:pPr>
       <w:r>
-        <w:t>2  SISTEMA DE ALERTAS DE SAUDE (LEDS + BUZZER)</w:t>
+        <w:t>2  SISTEMA DE ALERTAS DE SAÚDE (LEDS + BUZZER)</w:t>
       </w:r>
     </w:p>
     <w:p>
@@ -760,7 +760,7 @@
         <w:pStyle w:val="Heading2"/>
       </w:pPr>
       <w:r>
-        <w:t>2.1  Descricao do Funcionamento</w:t>
+        <w:t>2.1  Descrição do Funcionamento</w:t>
       </w:r>
     </w:p>
     <w:p>
@@ -775,7 +775,7 @@
           <w:b w:val="0"/>
           <w:sz w:val="24"/>
         </w:rPr>
-        <w:t>O sistema de alertas avalia continuamente dois sinais vitais do paciente e aciona indicadores visuais (LEDs) e sonoros (buzzer) de acordo com a gravidade detectada. O objetivo e fornecer feedback imediato sobre o estado de saude, classificando-o em tres niveis: Normal, Atencao e Critico.</w:t>
+        <w:t>O sistema de alertas avalia continuamente dois sinais vitais do paciente e aciona indicadores visuais (LEDs) e sonoros (buzzer) de acordo com a gravidade detectada. O objetivo é fornecer feedback imediato sobre o estado de saúde, classificando-o em três níveis: Normal, Atenção e Crítico.</w:t>
       </w:r>
     </w:p>
     <w:p>
@@ -790,7 +790,7 @@
           <w:b w:val="0"/>
           <w:sz w:val="24"/>
         </w:rPr>
-        <w:t>A frequencia cardiaca (FC) e classificada em tres faixas: Critico quando FC &lt; 50 ou FC &gt; 160 BPM; Atencao quando FC &lt; 60 ou FC &gt; 100 BPM (fora da faixa normal, mas nao critico); e Normal quando 60 &lt;= FC &lt;= 100 BPM.</w:t>
+        <w:t>A frequência cardíaca (FC) é classificada em três faixas: Crítico quando FC &lt; 50 ou FC &gt; 160 BPM; Atenção quando FC &lt; 60 ou FC &gt; 100 BPM (fora da faixa normal, mas não crítico); e Normal quando 60 ≤ FC ≤ 100 BPM.</w:t>
       </w:r>
     </w:p>
     <w:p>
@@ -805,7 +805,7 @@
           <w:b w:val="0"/>
           <w:sz w:val="24"/>
         </w:rPr>
-        <w:t>A temperatura corporal (T) segue classificacao analoga: Critico quando T &lt; 34.0 ou T &gt; 39.0 graus Celsius; Atencao quando T &lt; 35.5 ou T &gt; 37.5 graus (fora do normal, mas nao critico); e Normal quando 35.5 &lt;= T &lt;= 37.5 graus Celsius.</w:t>
+        <w:t>A temperatura corporal (T) segue classificação análoga: Crítico quando T &lt; 34,0 ou T &gt; 39,0 graus Celsius; Atenção quando T &lt; 35,5 ou T &gt; 37,5 graus (fora do normal, mas não crítico); e Normal quando 35,5 ≤ T ≤ 37,5 graus Celsius.</w:t>
       </w:r>
     </w:p>
     <w:p>
@@ -813,7 +813,7 @@
         <w:pStyle w:val="Heading2"/>
       </w:pPr>
       <w:r>
-        <w:t>2.2  Variaveis Booleanas de Entrada</w:t>
+        <w:t>2.2  Variáveis Booleanas de Entrada</w:t>
       </w:r>
     </w:p>
     <w:p>
@@ -828,7 +828,7 @@
           <w:b w:val="0"/>
           <w:sz w:val="24"/>
         </w:rPr>
-        <w:t>Para modelar a logica do sistema de alertas, definimos quatro variaveis binarias que representam a classificacao dos sensores:</w:t>
+        <w:t>Para modelar a lógica do sistema de alertas, definimos quatro variáveis binárias que representam a classificação dos sensores:</w:t>
       </w:r>
     </w:p>
     <w:p>
@@ -842,7 +842,7 @@
           <w:i/>
           <w:sz w:val="20"/>
         </w:rPr>
-        <w:t>Quadro 1 - Variaveis de entrada do Sistema de Alertas</w:t>
+        <w:t>Quadro 1 — Variáveis de entrada do Sistema de Alertas</w:t>
       </w:r>
     </w:p>
     <w:tbl>
@@ -874,7 +874,7 @@
                 <w:b/>
                 <w:sz w:val="20"/>
               </w:rPr>
-              <w:t>Variavel</w:t>
+              <w:t>Variável</w:t>
             </w:r>
           </w:p>
         </w:tc>
@@ -914,7 +914,7 @@
                 <w:b/>
                 <w:sz w:val="20"/>
               </w:rPr>
-              <w:t>Condicao</w:t>
+              <w:t>Condição</w:t>
             </w:r>
           </w:p>
         </w:tc>
@@ -952,7 +952,7 @@
                 <w:rFonts w:ascii="Times New Roman" w:hAnsi="Times New Roman"/>
                 <w:sz w:val="20"/>
               </w:rPr>
-              <w:t>FC em faixa critica</w:t>
+              <w:t>FC em faixa crítica</w:t>
             </w:r>
           </w:p>
         </w:tc>
@@ -1008,7 +1008,7 @@
                 <w:rFonts w:ascii="Times New Roman" w:hAnsi="Times New Roman"/>
                 <w:sz w:val="20"/>
               </w:rPr>
-              <w:t>FC em faixa de atencao</w:t>
+              <w:t>FC em faixa de atenção</w:t>
             </w:r>
           </w:p>
         </w:tc>
@@ -1026,7 +1026,7 @@
                 <w:rFonts w:ascii="Times New Roman" w:hAnsi="Times New Roman"/>
                 <w:sz w:val="20"/>
               </w:rPr>
-              <w:t>(50 &lt;= FC &lt; 60) OR (100 &lt; FC &lt;= 160)</w:t>
+              <w:t>(50 ≤ FC &lt; 60) OR (100 &lt; FC ≤ 160)</w:t>
             </w:r>
           </w:p>
         </w:tc>
@@ -1064,7 +1064,7 @@
                 <w:rFonts w:ascii="Times New Roman" w:hAnsi="Times New Roman"/>
                 <w:sz w:val="20"/>
               </w:rPr>
-              <w:t>Temp. em faixa critica</w:t>
+              <w:t>Temp. em faixa crítica</w:t>
             </w:r>
           </w:p>
         </w:tc>
@@ -1082,7 +1082,7 @@
                 <w:rFonts w:ascii="Times New Roman" w:hAnsi="Times New Roman"/>
                 <w:sz w:val="20"/>
               </w:rPr>
-              <w:t>T &lt; 34.0 OR T &gt; 39.0</w:t>
+              <w:t>T &lt; 34,0 OR T &gt; 39,0</w:t>
             </w:r>
           </w:p>
         </w:tc>
@@ -1120,7 +1120,7 @@
                 <w:rFonts w:ascii="Times New Roman" w:hAnsi="Times New Roman"/>
                 <w:sz w:val="20"/>
               </w:rPr>
-              <w:t>Temp. em faixa de atencao</w:t>
+              <w:t>Temp. em faixa de atenção</w:t>
             </w:r>
           </w:p>
         </w:tc>
@@ -1138,7 +1138,7 @@
                 <w:rFonts w:ascii="Times New Roman" w:hAnsi="Times New Roman"/>
                 <w:sz w:val="20"/>
               </w:rPr>
-              <w:t>(34.0 &lt;= T &lt; 35.5) OR (37.5 &lt; T &lt;= 39.0)</w:t>
+              <w:t>(34,0 ≤ T &lt; 35,5) OR (37,5 &lt; T ≤ 39,0)</w:t>
             </w:r>
           </w:p>
         </w:tc>
@@ -1171,7 +1171,7 @@
           <w:b w:val="0"/>
           <w:sz w:val="24"/>
         </w:rPr>
-        <w:t>Restricoes importantes: As variaveis A e B sao mutuamente exclusivas (A . B = 0), pois a frequencia cardiaca nao pode estar simultaneamente em faixa critica e de atencao. Da mesma forma, C e D sao mutuamente exclusivas (C . D = 0). Essas restricoes geram condicoes "don't care" na tabela verdade e nos mapas de Karnaugh.</w:t>
+        <w:t>Restrições importantes: As variáveis A e B são mutuamente exclusivas (A · B = 0), pois a frequência cardíaca não pode estar simultaneamente em faixa crítica e de atenção. Da mesma forma, C e D são mutuamente exclusivas (C · D = 0). Essas restrições geram condições "don't care" na tabela verdade e nos mapas de Karnaugh.</w:t>
       </w:r>
     </w:p>
     <w:p>
@@ -1179,7 +1179,7 @@
         <w:pStyle w:val="Heading2"/>
       </w:pPr>
       <w:r>
-        <w:t>2.3  Saidas do Sistema</w:t>
+        <w:t>2.3  Saídas do Sistema</w:t>
       </w:r>
     </w:p>
     <w:p>
@@ -1193,7 +1193,7 @@
           <w:i/>
           <w:sz w:val="20"/>
         </w:rPr>
-        <w:t>Quadro 2 - Saidas do Sistema de Alertas</w:t>
+        <w:t>Quadro 2 — Saídas do Sistema de Alertas</w:t>
       </w:r>
     </w:p>
     <w:tbl>
@@ -1225,7 +1225,7 @@
                 <w:b/>
                 <w:sz w:val="20"/>
               </w:rPr>
-              <w:t>Saida</w:t>
+              <w:t>Saída</w:t>
             </w:r>
           </w:p>
         </w:tc>
@@ -1265,7 +1265,7 @@
                 <w:b/>
                 <w:sz w:val="20"/>
               </w:rPr>
-              <w:t>Componente Fisico</w:t>
+              <w:t>Componente Físico</w:t>
             </w:r>
           </w:p>
         </w:tc>
@@ -1303,7 +1303,7 @@
                 <w:rFonts w:ascii="Times New Roman" w:hAnsi="Times New Roman"/>
                 <w:sz w:val="20"/>
               </w:rPr>
-              <w:t>LED Vermelho (alerta critico)</w:t>
+              <w:t>LED Vermelho (alerta crítico)</w:t>
             </w:r>
           </w:p>
         </w:tc>
@@ -1359,7 +1359,7 @@
                 <w:rFonts w:ascii="Times New Roman" w:hAnsi="Times New Roman"/>
                 <w:sz w:val="20"/>
               </w:rPr>
-              <w:t>LED Amarelo (atencao)</w:t>
+              <w:t>LED Amarelo (atenção)</w:t>
             </w:r>
           </w:p>
         </w:tc>
@@ -1515,7 +1515,7 @@
         <w:pStyle w:val="Heading2"/>
       </w:pPr>
       <w:r>
-        <w:t>2.4  Expressoes Logicas Originais</w:t>
+        <w:t>2.4  Expressões Lógicas Originais</w:t>
       </w:r>
     </w:p>
     <w:p>
@@ -1530,7 +1530,7 @@
           <w:b w:val="0"/>
           <w:sz w:val="24"/>
         </w:rPr>
-        <w:t>As expressoes booleanas foram extraidas diretamente da funcao evaluateHealth() no arquivo sketch.ino. Utilizamos a notacao onde "+" representa a operacao OR, "." representa AND, e o apostrofo ("'" ) representa NOT (complemento):</w:t>
+        <w:t>As expressões booleanas foram extraídas diretamente da função evaluateHealth() no arquivo sketch.ino. Utilizamos a notação onde "+" representa a operação OR, "·" representa AND, e o apóstrofo ("'" ) representa NOT (complemento):</w:t>
       </w:r>
     </w:p>
     <w:p>
@@ -1558,7 +1558,7 @@
           <w:b/>
           <w:sz w:val="22"/>
         </w:rPr>
-        <w:t>Y = A' . C' . (B + D)</w:t>
+        <w:t>Y = A' · C' · (B + D)</w:t>
       </w:r>
     </w:p>
     <w:p>
@@ -1572,7 +1572,7 @@
           <w:b/>
           <w:sz w:val="22"/>
         </w:rPr>
-        <w:t>G = A' . B' . C' . D'</w:t>
+        <w:t>G = A' · B' · C' · D'</w:t>
       </w:r>
     </w:p>
     <w:p>
@@ -1601,7 +1601,7 @@
           <w:b w:val="0"/>
           <w:sz w:val="24"/>
         </w:rPr>
-        <w:t>O objetivo desta logica e: o LED vermelho (R) e o buzzer (Z) ativam quando QUALQUER sinal vital esta em nivel critico. O LED amarelo (Y) ativa quando NENHUM sinal esta critico mas ALGUM esta em faixa de atencao. O LED verde (G) ativa somente quando TODOS os sinais vitais estao na faixa normal.</w:t>
+        <w:t>O objetivo desta lógica é: o LED vermelho (R) e o buzzer (Z) ativam quando QUALQUER sinal vital está em nível crítico. O LED amarelo (Y) ativa quando NENHUM sinal está crítico mas ALGUM está em faixa de atenção. O LED verde (G) ativa somente quando TODOS os sinais vitais estão na faixa normal.</w:t>
       </w:r>
     </w:p>
     <w:p>
@@ -1628,7 +1628,7 @@
           <w:b w:val="0"/>
           <w:sz w:val="24"/>
         </w:rPr>
-        <w:t>A tabela verdade a seguir apresenta todas as 16 combinacoes possiveis das 4 variaveis de entrada. As combinacoes onde A.B=1 ou C.D=1 sao marcadas como "X" (don't care), pois representam cenarios fisicamente impossiveis:</w:t>
+        <w:t>A tabela verdade a seguir apresenta todas as 16 combinações possíveis das 4 variáveis de entrada. As combinações onde A·B=1 ou C·D=1 são marcadas como "X" (don't care), pois representam cenários fisicamente impossíveis:</w:t>
       </w:r>
     </w:p>
     <w:p>
@@ -1642,7 +1642,7 @@
           <w:i/>
           <w:sz w:val="20"/>
         </w:rPr>
-        <w:t>Quadro 3 - Tabela Verdade Original do Sistema de Alertas</w:t>
+        <w:t>Quadro 3 — Tabela Verdade Original do Sistema de Alertas</w:t>
       </w:r>
     </w:p>
     <w:tbl>
@@ -1861,7 +1861,7 @@
                 <w:b/>
                 <w:sz w:val="20"/>
               </w:rPr>
-              <w:t>Observacao</w:t>
+              <w:t>Observação</w:t>
             </w:r>
           </w:p>
         </w:tc>
@@ -2225,7 +2225,7 @@
                 <w:rFonts w:ascii="Times New Roman" w:hAnsi="Times New Roman"/>
                 <w:sz w:val="20"/>
               </w:rPr>
-              <w:t>FC normal, Temp atencao</w:t>
+              <w:t>FC normal, Temp atenção</w:t>
             </w:r>
           </w:p>
         </w:tc>
@@ -2407,7 +2407,7 @@
                 <w:rFonts w:ascii="Times New Roman" w:hAnsi="Times New Roman"/>
                 <w:sz w:val="20"/>
               </w:rPr>
-              <w:t>FC normal, Temp critica</w:t>
+              <w:t>FC normal, Temp crítica</w:t>
             </w:r>
           </w:p>
         </w:tc>
@@ -2589,7 +2589,7 @@
                 <w:rFonts w:ascii="Times New Roman" w:hAnsi="Times New Roman"/>
                 <w:sz w:val="20"/>
               </w:rPr>
-              <w:t>Impossivel (C.D=0)</w:t>
+              <w:t>Impossível (C·D=0)</w:t>
             </w:r>
           </w:p>
         </w:tc>
@@ -2771,7 +2771,7 @@
                 <w:rFonts w:ascii="Times New Roman" w:hAnsi="Times New Roman"/>
                 <w:sz w:val="20"/>
               </w:rPr>
-              <w:t>FC atencao, Temp normal</w:t>
+              <w:t>FC atenção, Temp normal</w:t>
             </w:r>
           </w:p>
         </w:tc>
@@ -2953,7 +2953,7 @@
                 <w:rFonts w:ascii="Times New Roman" w:hAnsi="Times New Roman"/>
                 <w:sz w:val="20"/>
               </w:rPr>
-              <w:t>FC atencao, Temp atencao</w:t>
+              <w:t>FC atenção, Temp atenção</w:t>
             </w:r>
           </w:p>
         </w:tc>
@@ -3135,7 +3135,7 @@
                 <w:rFonts w:ascii="Times New Roman" w:hAnsi="Times New Roman"/>
                 <w:sz w:val="20"/>
               </w:rPr>
-              <w:t>FC atencao, Temp critica</w:t>
+              <w:t>FC atenção, Temp crítica</w:t>
             </w:r>
           </w:p>
         </w:tc>
@@ -3317,7 +3317,7 @@
                 <w:rFonts w:ascii="Times New Roman" w:hAnsi="Times New Roman"/>
                 <w:sz w:val="20"/>
               </w:rPr>
-              <w:t>Impossivel (C.D=0)</w:t>
+              <w:t>Impossível (C·D=0)</w:t>
             </w:r>
           </w:p>
         </w:tc>
@@ -3499,7 +3499,7 @@
                 <w:rFonts w:ascii="Times New Roman" w:hAnsi="Times New Roman"/>
                 <w:sz w:val="20"/>
               </w:rPr>
-              <w:t>FC critica, Temp normal</w:t>
+              <w:t>FC crítica, Temp normal</w:t>
             </w:r>
           </w:p>
         </w:tc>
@@ -3681,7 +3681,7 @@
                 <w:rFonts w:ascii="Times New Roman" w:hAnsi="Times New Roman"/>
                 <w:sz w:val="20"/>
               </w:rPr>
-              <w:t>FC critica, Temp atencao</w:t>
+              <w:t>FC crítica, Temp atenção</w:t>
             </w:r>
           </w:p>
         </w:tc>
@@ -3863,7 +3863,7 @@
                 <w:rFonts w:ascii="Times New Roman" w:hAnsi="Times New Roman"/>
                 <w:sz w:val="20"/>
               </w:rPr>
-              <w:t>FC critica, Temp critica</w:t>
+              <w:t>FC crítica, Temp crítica</w:t>
             </w:r>
           </w:p>
         </w:tc>
@@ -4045,7 +4045,7 @@
                 <w:rFonts w:ascii="Times New Roman" w:hAnsi="Times New Roman"/>
                 <w:sz w:val="20"/>
               </w:rPr>
-              <w:t>Impossivel (C.D=0)</w:t>
+              <w:t>Impossível (C·D=0)</w:t>
             </w:r>
           </w:p>
         </w:tc>
@@ -4227,7 +4227,7 @@
                 <w:rFonts w:ascii="Times New Roman" w:hAnsi="Times New Roman"/>
                 <w:sz w:val="20"/>
               </w:rPr>
-              <w:t>Impossivel (A.B=0)</w:t>
+              <w:t>Impossível (A·B=0)</w:t>
             </w:r>
           </w:p>
         </w:tc>
@@ -4409,7 +4409,7 @@
                 <w:rFonts w:ascii="Times New Roman" w:hAnsi="Times New Roman"/>
                 <w:sz w:val="20"/>
               </w:rPr>
-              <w:t>Impossivel (A.B=0)</w:t>
+              <w:t>Impossível (A·B=0)</w:t>
             </w:r>
           </w:p>
         </w:tc>
@@ -4591,7 +4591,7 @@
                 <w:rFonts w:ascii="Times New Roman" w:hAnsi="Times New Roman"/>
                 <w:sz w:val="20"/>
               </w:rPr>
-              <w:t>Impossivel (A.B=0)</w:t>
+              <w:t>Impossível (A·B=0)</w:t>
             </w:r>
           </w:p>
         </w:tc>
@@ -4773,7 +4773,7 @@
                 <w:rFonts w:ascii="Times New Roman" w:hAnsi="Times New Roman"/>
                 <w:sz w:val="20"/>
               </w:rPr>
-              <w:t>Impossivel (A.B=0, C.D=0)</w:t>
+              <w:t>Impossível (A·B=0, C·D=0)</w:t>
             </w:r>
           </w:p>
         </w:tc>
@@ -4804,7 +4804,7 @@
         <w:pStyle w:val="Heading2"/>
       </w:pPr>
       <w:r>
-        <w:t>2.6  Simplificacao por Algebra Booleana</w:t>
+        <w:t>2.6  Simplificação por Álgebra Booleana</w:t>
       </w:r>
     </w:p>
     <w:p>
@@ -4818,7 +4818,7 @@
           <w:b/>
           <w:sz w:val="24"/>
         </w:rPr>
-        <w:t>Saida R (LED Vermelho):</w:t>
+        <w:t>Saída R (LED Vermelho):</w:t>
       </w:r>
     </w:p>
     <w:p>
@@ -4847,7 +4847,7 @@
           <w:b w:val="0"/>
           <w:sz w:val="24"/>
         </w:rPr>
-        <w:t>A expressao ja esta na forma minima. Uma soma (OR) de duas variaveis nao pode ser mais simplificada.</w:t>
+        <w:t>A expressão já está na forma mínima. Uma soma (OR) de duas variáveis não pode ser mais simplificada.</w:t>
       </w:r>
     </w:p>
     <w:p>
@@ -4861,7 +4861,7 @@
           <w:b/>
           <w:sz w:val="24"/>
         </w:rPr>
-        <w:t>Saida Z (Buzzer):</w:t>
+        <w:t>Saída Z (Buzzer):</w:t>
       </w:r>
     </w:p>
     <w:p>
@@ -4904,7 +4904,7 @@
           <w:b w:val="0"/>
           <w:sz w:val="24"/>
         </w:rPr>
-        <w:t>Observamos que Z e identico a R. Portanto, o buzzer pode compartilhar o mesmo sinal logico do LED vermelho, eliminando uma porta logica redundante.</w:t>
+        <w:t>Observamos que Z é idêntico a R. Portanto, o buzzer pode compartilhar o mesmo sinal lógico do LED vermelho, eliminando uma porta lógica redundante.</w:t>
       </w:r>
     </w:p>
     <w:p>
@@ -4918,7 +4918,7 @@
           <w:b/>
           <w:sz w:val="24"/>
         </w:rPr>
-        <w:t>Saida Y (LED Amarelo):</w:t>
+        <w:t>Saída Y (LED Amarelo):</w:t>
       </w:r>
     </w:p>
     <w:p>
@@ -4932,7 +4932,7 @@
           <w:b/>
           <w:sz w:val="22"/>
         </w:rPr>
-        <w:t>Original:  Y = A' . C' . (B + D)</w:t>
+        <w:t>Original:  Y = A' · C' · (B + D)</w:t>
       </w:r>
     </w:p>
     <w:p>
@@ -4947,7 +4947,7 @@
           <w:b w:val="0"/>
           <w:sz w:val="24"/>
         </w:rPr>
-        <w:t>Aplicando a Lei de De Morgan, sabemos que A' . C' = (A + C)'. Como R = A + C, temos que A' . C' = R'. Portanto:</w:t>
+        <w:t>Aplicando a Lei de De Morgan, sabemos que A' · C' = (A + C)'. Como R = A + C, temos que A' · C' = R'. Portanto:</w:t>
       </w:r>
     </w:p>
     <w:p>
@@ -4961,7 +4961,7 @@
           <w:b/>
           <w:sz w:val="22"/>
         </w:rPr>
-        <w:t>Simplificado:  Y = R' . (B + D)</w:t>
+        <w:t>Simplificado:  Y = R' · (B + D)</w:t>
       </w:r>
     </w:p>
     <w:p>
@@ -4976,7 +4976,7 @@
           <w:b w:val="0"/>
           <w:sz w:val="24"/>
         </w:rPr>
-        <w:t>Esta substituicao elimina duas portas NOT e uma porta AND de 2 entradas, substituindo por uma unica porta NOT sobre o sinal R ja calculado.</w:t>
+        <w:t>Esta substituição elimina duas portas NOT e uma porta AND de 2 entradas, substituindo por uma única porta NOT sobre o sinal R já calculado.</w:t>
       </w:r>
     </w:p>
     <w:p>
@@ -4990,7 +4990,7 @@
           <w:b/>
           <w:sz w:val="24"/>
         </w:rPr>
-        <w:t>Prova da equivalencia (Y):</w:t>
+        <w:t>Prova da equivalência (Y):</w:t>
       </w:r>
     </w:p>
     <w:p>
@@ -5018,7 +5018,7 @@
           <w:b/>
           <w:sz w:val="22"/>
         </w:rPr>
-        <w:t>R' = (A + C)' = A' . C'   [Lei de De Morgan]</w:t>
+        <w:t>R' = (A + C)' = A' · C'   [Lei de De Morgan]</w:t>
       </w:r>
     </w:p>
     <w:p>
@@ -5032,7 +5032,7 @@
           <w:b/>
           <w:sz w:val="22"/>
         </w:rPr>
-        <w:t>R' . (B + D) = A' . C' . (B + D)   [Q.E.D.]</w:t>
+        <w:t>R' · (B + D) = A' · C' · (B + D)   [Q.E.D.]</w:t>
       </w:r>
     </w:p>
     <w:p>
@@ -5046,7 +5046,7 @@
           <w:b/>
           <w:sz w:val="24"/>
         </w:rPr>
-        <w:t>Saida G (LED Verde):</w:t>
+        <w:t>Saída G (LED Verde):</w:t>
       </w:r>
     </w:p>
     <w:p>
@@ -5060,7 +5060,7 @@
           <w:b/>
           <w:sz w:val="22"/>
         </w:rPr>
-        <w:t>Original:  G = A' . B' . C' . D'</w:t>
+        <w:t>Original:  G = A' · B' · C' · D'</w:t>
       </w:r>
     </w:p>
     <w:p>
@@ -5075,7 +5075,7 @@
           <w:b w:val="0"/>
           <w:sz w:val="24"/>
         </w:rPr>
-        <w:t>Como R, Y e G sao mutuamente exclusivos e exaustivos (exatamente um LED deve estar ligado a qualquer momento), podemos derivar G a partir das outras saidas:</w:t>
+        <w:t>Como R, Y e G são mutuamente exclusivos e exaustivos (exatamente um LED deve estar ligado a qualquer momento), podemos derivar G a partir das outras saídas:</w:t>
       </w:r>
     </w:p>
     <w:p>
@@ -5089,7 +5089,7 @@
           <w:b/>
           <w:sz w:val="22"/>
         </w:rPr>
-        <w:t>R + Y = (A + C) + (A' . C' . (B + D))</w:t>
+        <w:t>R + Y = (A + C) + (A' · C' · (B + D))</w:t>
       </w:r>
     </w:p>
     <w:p>
@@ -5103,7 +5103,7 @@
           <w:b w:val="0"/>
           <w:sz w:val="24"/>
         </w:rPr>
-        <w:t>Aplicando o Teorema da Absorcao (X + X'.Y = X + Y):</w:t>
+        <w:t>Aplicando o Teorema da Absorção (X + X'·Y = X + Y):</w:t>
       </w:r>
     </w:p>
     <w:p>
@@ -5145,7 +5145,7 @@
           <w:b/>
           <w:sz w:val="22"/>
         </w:rPr>
-        <w:t>Simplificado:  G = (R + Y)' = R' . Y'</w:t>
+        <w:t>Simplificado:  G = (R + Y)' = R' · Y'</w:t>
       </w:r>
     </w:p>
     <w:p>
@@ -5173,7 +5173,7 @@
           <w:b/>
           <w:sz w:val="22"/>
         </w:rPr>
-        <w:t>(R + Y)' = (A + B + C + D)' = A' . B' . C' . D'   [Q.E.D.]</w:t>
+        <w:t>(R + Y)' = (A + B + C + D)' = A' · B' · C' · D'   [Q.E.D.]</w:t>
       </w:r>
     </w:p>
     <w:p>
@@ -5201,7 +5201,7 @@
           <w:b w:val="0"/>
           <w:sz w:val="24"/>
         </w:rPr>
-        <w:t>A seguir, apresentamos os mapas de Karnaugh para cada saida. As celulas marcadas com "X" representam condicoes don't care (combinacoes impossiveis pelas restricoes A.B=0 e C.D=0), que podem ser aproveitadas para simplificacao.</w:t>
+        <w:t>A seguir, apresentamos os mapas de Karnaugh para cada saída. As células marcadas com "X" representam condições don't care (combinações impossíveis pelas restrições A·B=0 e C·D=0), que podem ser aproveitadas para simplificação.</w:t>
       </w:r>
     </w:p>
     <w:p>
@@ -5229,7 +5229,7 @@
           <w:i/>
           <w:sz w:val="20"/>
         </w:rPr>
-        <w:t>Quadro 4 - Mapa de Karnaugh: R (LED Vermelho)</w:t>
+        <w:t>Quadro 4 — Mapa de Karnaugh: R (LED Vermelho)</w:t>
       </w:r>
     </w:p>
     <w:tbl>
@@ -5744,7 +5744,7 @@
           <w:b w:val="0"/>
           <w:sz w:val="24"/>
         </w:rPr>
-        <w:t>Agrupamentos identificados: Grupo 1 cobre toda a linha A=1 (termo A); Grupo 2 cobre toda a coluna C=1 (termo C). Resultado: R(min) = A + C.</w:t>
+        <w:t>Agrupamentos identificados: Grupo 1 cobre toda a linha A=1 (termo A); Grupo 2 cobre toda a coluna C=1 (termo C). Resultado: R(mín) = A + C.</w:t>
       </w:r>
     </w:p>
     <w:p>
@@ -5772,7 +5772,7 @@
           <w:i/>
           <w:sz w:val="20"/>
         </w:rPr>
-        <w:t>Quadro 5 - Mapa de Karnaugh: Y (LED Amarelo)</w:t>
+        <w:t>Quadro 5 — Mapa de Karnaugh: Y (LED Amarelo)</w:t>
       </w:r>
     </w:p>
     <w:tbl>
@@ -6287,7 +6287,7 @@
           <w:b w:val="0"/>
           <w:sz w:val="24"/>
         </w:rPr>
-        <w:t>Agrupamentos: Grupo 1 (A'D, aproveitando don't cares) e Grupo 2 (BC', aproveitando don't cares). Y(min) = A'.D + B.C' = A'.C'.(B+D) = R'.(B+D).</w:t>
+        <w:t>Agrupamentos: Grupo 1 (A'D, aproveitando don't cares) e Grupo 2 (BC', aproveitando don't cares). Y(mín) = A'·D + B·C' = A'·C'·(B+D) = R'·(B+D).</w:t>
       </w:r>
     </w:p>
     <w:p>
@@ -6315,7 +6315,7 @@
           <w:i/>
           <w:sz w:val="20"/>
         </w:rPr>
-        <w:t>Quadro 6 - Mapa de Karnaugh: G (LED Verde)</w:t>
+        <w:t>Quadro 6 — Mapa de Karnaugh: G (LED Verde)</w:t>
       </w:r>
     </w:p>
     <w:tbl>
@@ -6830,7 +6830,7 @@
           <w:b w:val="0"/>
           <w:sz w:val="24"/>
         </w:rPr>
-        <w:t>Unica celula com valor 1: posicao (A=0, B=0, C=0, D=0). Nao ha agrupamento possivel. G(min) = A'.B'.C'.D'.</w:t>
+        <w:t>Única célula com valor 1: posição (A=0, B=0, C=0, D=0). Não há agrupamento possível. G(mín) = A'·B'·C'·D'.</w:t>
       </w:r>
     </w:p>
     <w:p>
@@ -6843,7 +6843,7 @@
         <w:pStyle w:val="Heading2"/>
       </w:pPr>
       <w:r>
-        <w:t>2.8  Expressoes Simplificadas</w:t>
+        <w:t>2.8  Expressões Simplificadas</w:t>
       </w:r>
     </w:p>
     <w:p>
@@ -6857,7 +6857,7 @@
           <w:i/>
           <w:sz w:val="20"/>
         </w:rPr>
-        <w:t>Quadro 7 - Comparacao das Expressoes: Sistema de Alertas</w:t>
+        <w:t>Quadro 7 — Comparação das Expressões: Sistema de Alertas</w:t>
       </w:r>
     </w:p>
     <w:tbl>
@@ -6890,7 +6890,7 @@
                 <w:b/>
                 <w:sz w:val="20"/>
               </w:rPr>
-              <w:t>Saida</w:t>
+              <w:t>Saída</w:t>
             </w:r>
           </w:p>
         </w:tc>
@@ -6910,7 +6910,7 @@
                 <w:b/>
                 <w:sz w:val="20"/>
               </w:rPr>
-              <w:t>Expressao Original</w:t>
+              <w:t>Expressão Original</w:t>
             </w:r>
           </w:p>
         </w:tc>
@@ -6930,7 +6930,7 @@
                 <w:b/>
                 <w:sz w:val="20"/>
               </w:rPr>
-              <w:t>Expressao Simplificada</w:t>
+              <w:t>Expressão Simplificada</w:t>
             </w:r>
           </w:p>
         </w:tc>
@@ -6950,7 +6950,7 @@
                 <w:b/>
                 <w:sz w:val="20"/>
               </w:rPr>
-              <w:t>Metodo</w:t>
+              <w:t>Método</w:t>
             </w:r>
           </w:p>
         </w:tc>
@@ -7024,7 +7024,7 @@
                 <w:rFonts w:ascii="Times New Roman" w:hAnsi="Times New Roman"/>
                 <w:sz w:val="20"/>
               </w:rPr>
-              <w:t>Ja minima</w:t>
+              <w:t>Já mínima</w:t>
             </w:r>
           </w:p>
         </w:tc>
@@ -7098,7 +7098,7 @@
                 <w:rFonts w:ascii="Times New Roman" w:hAnsi="Times New Roman"/>
                 <w:sz w:val="20"/>
               </w:rPr>
-              <w:t>Eliminacao redundancia</w:t>
+              <w:t>Eliminação redundância</w:t>
             </w:r>
           </w:p>
         </w:tc>
@@ -7136,7 +7136,7 @@
                 <w:rFonts w:ascii="Times New Roman" w:hAnsi="Times New Roman"/>
                 <w:sz w:val="20"/>
               </w:rPr>
-              <w:t>A'.C'.(B+D)</w:t>
+              <w:t>A'·C'·(B+D)</w:t>
             </w:r>
           </w:p>
         </w:tc>
@@ -7154,7 +7154,7 @@
                 <w:rFonts w:ascii="Times New Roman" w:hAnsi="Times New Roman"/>
                 <w:sz w:val="20"/>
               </w:rPr>
-              <w:t>R'.(B+D)</w:t>
+              <w:t>R'·(B+D)</w:t>
             </w:r>
           </w:p>
         </w:tc>
@@ -7210,7 +7210,7 @@
                 <w:rFonts w:ascii="Times New Roman" w:hAnsi="Times New Roman"/>
                 <w:sz w:val="20"/>
               </w:rPr>
-              <w:t>A'.B'.C'.D'</w:t>
+              <w:t>A'·B'·C'·D'</w:t>
             </w:r>
           </w:p>
         </w:tc>
@@ -7246,7 +7246,7 @@
                 <w:rFonts w:ascii="Times New Roman" w:hAnsi="Times New Roman"/>
                 <w:sz w:val="20"/>
               </w:rPr>
-              <w:t>Derivacao por exclusao</w:t>
+              <w:t>Derivação por exclusão</w:t>
             </w:r>
           </w:p>
         </w:tc>
@@ -7272,7 +7272,7 @@
         <w:pStyle w:val="Heading2"/>
       </w:pPr>
       <w:r>
-        <w:t>2.9  Diagramas Logicos</w:t>
+        <w:t>2.9  Diagramas Lógicos</w:t>
       </w:r>
     </w:p>
     <w:p>
@@ -7286,7 +7286,7 @@
           <w:b/>
           <w:sz w:val="24"/>
         </w:rPr>
-        <w:t>Circuito Original (8 portas logicas):</w:t>
+        <w:t>Circuito Original (8 portas lógicas):</w:t>
       </w:r>
     </w:p>
     <w:p>
@@ -7300,7 +7300,7 @@
           <w:b w:val="0"/>
           <w:sz w:val="24"/>
         </w:rPr>
-        <w:t>O circuito original utiliza: 4 portas NOT (para A', B', C', D'), 2 portas AND (para A'.C' e para o produto final de Y, e para G com AND de 4 entradas), e 2 portas OR (para R=A+C e Z=A+C, e para B+D). Total: 8 portas com sinais redundantes.</w:t>
+        <w:t>O circuito original utiliza: 4 portas NOT (para A', B', C', D'), 2 portas AND (para A'·C' e para o produto final de Y, e para G com AND de 4 entradas), e 2 portas OR (para R=A+C e Z=A+C, e para B+D). Total: 8 portas com sinais redundantes.</w:t>
       </w:r>
     </w:p>
     <w:p>
@@ -7314,7 +7314,7 @@
           <w:b/>
           <w:sz w:val="24"/>
         </w:rPr>
-        <w:t>Circuito Simplificado (5 portas logicas):</w:t>
+        <w:t>Circuito Simplificado (5 portas lógicas):</w:t>
       </w:r>
     </w:p>
     <w:p>
@@ -7328,7 +7328,7 @@
           <w:b w:val="0"/>
           <w:sz w:val="24"/>
         </w:rPr>
-        <w:t>O circuito simplificado utiliza: 1 porta OR (R = A+C), 1 porta NOT (R' a partir de R), 1 porta OR (B+D), 1 porta AND (Y = R'.(B+D)), e 1 porta NOR (G = (R+Y)'). O sinal Z e conectado diretamente a R (mesmo fio). Total: 5 portas, sem redundancia.</w:t>
+        <w:t>O circuito simplificado utiliza: 1 porta OR (R = A+C), 1 porta NOT (R' a partir de R), 1 porta OR (B+D), 1 porta AND (Y = R'·(B+D)), e 1 porta NOR (G = (R+Y)'). O sinal Z é conectado diretamente a R (mesmo fio). Total: 5 portas, sem redundância.</w:t>
       </w:r>
     </w:p>
     <w:p>
@@ -7343,7 +7343,7 @@
           <w:b/>
           <w:sz w:val="24"/>
         </w:rPr>
-        <w:t>Economia: Reducao de 8 para 5 portas logicas, representando uma reducao de 37,5% na complexidade do circuito.</w:t>
+        <w:t>Economia: Redução de 8 para 5 portas lógicas, representando uma redução de 37,5% na complexidade do circuito.</w:t>
       </w:r>
     </w:p>
     <w:p>
@@ -7356,7 +7356,7 @@
         <w:pStyle w:val="Heading2"/>
       </w:pPr>
       <w:r>
-        <w:t>2.10  Tabela Verdade Comparativa - Original vs Simplificado</w:t>
+        <w:t>2.10  Tabela Verdade Comparativa — Original vs Simplificado</w:t>
       </w:r>
     </w:p>
     <w:p>
@@ -7371,7 +7371,7 @@
           <w:b w:val="0"/>
           <w:sz w:val="24"/>
         </w:rPr>
-        <w:t>A tabela a seguir compara as saidas do modelo original e do modelo simplificado para todas as combinacoes validas de entrada (excluindo as condicoes impossíveis):</w:t>
+        <w:t>A tabela a seguir compara as saídas do modelo original e do modelo simplificado para todas as combinações válidas de entrada (excluindo as condições impossíveis):</w:t>
       </w:r>
     </w:p>
     <w:p>
@@ -7385,7 +7385,7 @@
           <w:i/>
           <w:sz w:val="20"/>
         </w:rPr>
-        <w:t>Quadro 8 - Tabela Verdade Comparativa: Sistema de Alertas</w:t>
+        <w:t>Quadro 8 — Tabela Verdade Comparativa: Sistema de Alertas</w:t>
       </w:r>
     </w:p>
     <w:tbl>
@@ -9824,7 +9824,7 @@
           <w:b/>
           <w:sz w:val="24"/>
         </w:rPr>
-        <w:t>Resultado: Todas as saidas do modelo simplificado sao identicas as do modelo original em todos os 9 cenarios validos. Os modelos sao comprovadamente equivalentes.</w:t>
+        <w:t>Resultado: Todas as saídas do modelo simplificado são idênticas às do modelo original em todos os 9 cenários válidos. Os modelos são comprovadamente equivalentes.</w:t>
       </w:r>
     </w:p>
     <w:p>
@@ -9837,7 +9837,7 @@
         <w:pStyle w:val="Heading1"/>
       </w:pPr>
       <w:r>
-        <w:t>3  SISTEMA DE GAMIFICACAO (PONTOS)</w:t>
+        <w:t>3  SISTEMA DE GAMIFICAÇÃO (PONTOS)</w:t>
       </w:r>
     </w:p>
     <w:p>
@@ -9845,7 +9845,7 @@
         <w:pStyle w:val="Heading2"/>
       </w:pPr>
       <w:r>
-        <w:t>3.1  Descricao e Variaveis</w:t>
+        <w:t>3.1  Descrição e Variáveis</w:t>
       </w:r>
     </w:p>
     <w:p>
@@ -9860,7 +9860,7 @@
           <w:b w:val="0"/>
           <w:sz w:val="24"/>
         </w:rPr>
-        <w:t>O sistema de gamificacao avalia periodicamente (a cada 30 segundos) se o paciente merece pontos de recompensa com base em cinco condicoes de saude saudavel. Cada condicao contribui pontos de forma independente. A logica foi extraida da funcao awardPoints() no sketch.ino.</w:t>
+        <w:t>O sistema de gamificação avalia periodicamente (a cada 30 segundos) se o paciente merece pontos de recompensa com base em cinco condições de saúde saudável. Cada condição contribui pontos de forma independente. A lógica foi extraída da função awardPoints() no sketch.ino.</w:t>
       </w:r>
     </w:p>
     <w:p>
@@ -9874,7 +9874,7 @@
           <w:i/>
           <w:sz w:val="20"/>
         </w:rPr>
-        <w:t>Quadro 9 - Variaveis de Entrada do Sistema de Gamificacao</w:t>
+        <w:t>Quadro 9 — Variáveis de Entrada do Sistema de Gamificação</w:t>
       </w:r>
     </w:p>
     <w:tbl>
@@ -9907,7 +9907,7 @@
                 <w:b/>
                 <w:sz w:val="20"/>
               </w:rPr>
-              <w:t>Variavel</w:t>
+              <w:t>Variável</w:t>
             </w:r>
           </w:p>
         </w:tc>
@@ -9947,7 +9947,7 @@
                 <w:b/>
                 <w:sz w:val="20"/>
               </w:rPr>
-              <w:t>Condicao</w:t>
+              <w:t>Condição</w:t>
             </w:r>
           </w:p>
         </w:tc>
@@ -10005,7 +10005,7 @@
                 <w:rFonts w:ascii="Times New Roman" w:hAnsi="Times New Roman"/>
                 <w:sz w:val="20"/>
               </w:rPr>
-              <w:t>FC esta normal</w:t>
+              <w:t>FC está normal</w:t>
             </w:r>
           </w:p>
         </w:tc>
@@ -10023,7 +10023,7 @@
                 <w:rFonts w:ascii="Times New Roman" w:hAnsi="Times New Roman"/>
                 <w:sz w:val="20"/>
               </w:rPr>
-              <w:t>60 &lt;= FC &lt;= 100</w:t>
+              <w:t>60 ≤ FC ≤ 100</w:t>
             </w:r>
           </w:p>
         </w:tc>
@@ -10245,7 +10245,7 @@
                 <w:rFonts w:ascii="Times New Roman" w:hAnsi="Times New Roman"/>
                 <w:sz w:val="20"/>
               </w:rPr>
-              <w:t>36.0 &lt;= T &lt;= 37.5</w:t>
+              <w:t>36,0 ≤ T ≤ 37,5</w:t>
             </w:r>
           </w:p>
         </w:tc>
@@ -10370,7 +10370,7 @@
           <w:b w:val="0"/>
           <w:sz w:val="24"/>
         </w:rPr>
-        <w:t>Restricao importante: P3 implica P2 (P3 -&gt; P2). Se a atividade e superior a 60%, necessariamente e superior a 30%. Portanto, a combinacao P3=1 com P2=0 e impossivel (P3 . P2' = 0).</w:t>
+        <w:t>Restrição importante: P3 implica P2 (P3 → P2). Se a atividade é superior a 60%, necessariamente é superior a 30%. Portanto, a combinação P3=1 com P2=0 é impossível (P3 · P2' = 0).</w:t>
       </w:r>
     </w:p>
     <w:p>
@@ -10384,7 +10384,7 @@
           <w:b/>
           <w:sz w:val="24"/>
         </w:rPr>
-        <w:t>Expressao original para "Ganha Pontos" (GP):</w:t>
+        <w:t>Expressão original para "Ganha Pontos" (GP):</w:t>
       </w:r>
     </w:p>
     <w:p>
@@ -10413,7 +10413,7 @@
           <w:b w:val="0"/>
           <w:sz w:val="24"/>
         </w:rPr>
-        <w:t>O paciente ganha alguma pontuacao se QUALQUER condicao saudavel for verdadeira.</w:t>
+        <w:t>O paciente ganha alguma pontuação se QUALQUER condição saudável for verdadeira.</w:t>
       </w:r>
     </w:p>
     <w:p>
@@ -10421,7 +10421,7 @@
         <w:pStyle w:val="Heading2"/>
       </w:pPr>
       <w:r>
-        <w:t>3.2  Simplificacao</w:t>
+        <w:t>3.2  Simplificação</w:t>
       </w:r>
     </w:p>
     <w:p>
@@ -10436,7 +10436,7 @@
           <w:b w:val="0"/>
           <w:sz w:val="24"/>
         </w:rPr>
-        <w:t>Aplicando o Teorema da Absorcao: como P3 -&gt; P2, toda vez que P3=1 temos P2=1. Portanto, o termo P3 e absorvido por P2 na operacao OR (X + X.Y = X). Formalmente: P2 + P3 = P2 (pois P3 esta contido em P2).</w:t>
+        <w:t>Aplicando o Teorema da Absorção: como P3 → P2, toda vez que P3=1 temos P2=1. Portanto, o termo P3 é absorvido por P2 na operação OR (X + X·Y = X). Formalmente: P2 + P3 = P2 (pois P3 está contido em P2).</w:t>
       </w:r>
     </w:p>
     <w:p>
@@ -10479,7 +10479,7 @@
           <w:b w:val="0"/>
           <w:sz w:val="24"/>
         </w:rPr>
-        <w:t>Simplificacao: Eliminamos a variavel P3 da expressao GP, reduzindo de uma porta OR de 5 entradas para uma porta OR de 4 entradas.</w:t>
+        <w:t>Simplificação: Eliminamos a variável P3 da expressão GP, reduzindo de uma porta OR de 5 entradas para uma porta OR de 4 entradas.</w:t>
       </w:r>
     </w:p>
     <w:p>
@@ -10492,7 +10492,7 @@
         <w:pStyle w:val="Heading2"/>
       </w:pPr>
       <w:r>
-        <w:t>3.3  Prova de Equivalencia</w:t>
+        <w:t>3.3  Prova de Equivalência</w:t>
       </w:r>
     </w:p>
     <w:p>
@@ -10507,7 +10507,7 @@
           <w:b w:val="0"/>
           <w:sz w:val="24"/>
         </w:rPr>
-        <w:t>A tabela verdade a seguir compara as saidas do modelo original e simplificado para todas as combinacoes validas (omitindo linhas onde P3=1 e P2=0, por serem impossiveis):</w:t>
+        <w:t>A tabela verdade a seguir compara as saídas do modelo original e simplificado para todas as combinações válidas (omitindo linhas onde P3=1 e P2=0, por serem impossíveis):</w:t>
       </w:r>
     </w:p>
     <w:p>
@@ -10521,7 +10521,7 @@
           <w:i/>
           <w:sz w:val="20"/>
         </w:rPr>
-        <w:t>Quadro 10 - Tabela Verdade Comparativa: Sistema de Gamificacao</w:t>
+        <w:t>Quadro 10 — Tabela Verdade Comparativa: Sistema de Gamificação</w:t>
       </w:r>
     </w:p>
     <w:tbl>
@@ -14235,7 +14235,7 @@
           <w:b/>
           <w:sz w:val="24"/>
         </w:rPr>
-        <w:t>Resultado: As saidas sao identicas em todas as 24 combinacoes validas. Os modelos sao comprovadamente equivalentes.</w:t>
+        <w:t>Resultado: As saídas são idênticas em todas as 24 combinações válidas. Os modelos são comprovadamente equivalentes.</w:t>
       </w:r>
     </w:p>
     <w:p>
@@ -14248,7 +14248,7 @@
         <w:pStyle w:val="Heading1"/>
       </w:pPr>
       <w:r>
-        <w:t>4  SISTEMA DE CLASSIFICACAO DE RISCO (CHECK-UP DIGITAL)</w:t>
+        <w:t>4  SISTEMA DE CLASSIFICAÇÃO DE RISCO (CHECK-UP DIGITAL)</w:t>
       </w:r>
     </w:p>
     <w:p>
@@ -14256,7 +14256,7 @@
         <w:pStyle w:val="Heading2"/>
       </w:pPr>
       <w:r>
-        <w:t>4.1  Descricao e Variaveis</w:t>
+        <w:t>4.1  Descrição e Variáveis</w:t>
       </w:r>
     </w:p>
     <w:p>
@@ -14271,7 +14271,7 @@
           <w:b w:val="0"/>
           <w:sz w:val="24"/>
         </w:rPr>
-        <w:t>Apos o paciente completar o check-up digital de 8 perguntas, o sistema calcula um score de risco (0 a 100) e classifica o resultado em tres niveis. A logica foi extraida da funcao calculateRiskScore() e do trecho de classificacao no sketch.ino.</w:t>
+        <w:t>Após o paciente completar o check-up digital de 8 perguntas, o sistema calcula um score de risco (0 a 100) e classifica o resultado em três níveis. A lógica foi extraída da função calculateRiskScore() e do trecho de classificação no sketch.ino.</w:t>
       </w:r>
     </w:p>
     <w:p>
@@ -14286,7 +14286,7 @@
           <w:b w:val="0"/>
           <w:sz w:val="24"/>
         </w:rPr>
-        <w:t>Para a modelagem booleana, simplificamos para 2 variaveis que representam os limiares de decisao do score:</w:t>
+        <w:t>Para a modelagem booleana, simplificamos para 2 variáveis que representam os limiares de decisão do score:</w:t>
       </w:r>
     </w:p>
     <w:p>
@@ -14300,7 +14300,7 @@
           <w:i/>
           <w:sz w:val="20"/>
         </w:rPr>
-        <w:t>Quadro 11 - Variaveis de Entrada do Sistema de Classificacao</w:t>
+        <w:t>Quadro 11 — Variáveis de Entrada do Sistema de Classificação</w:t>
       </w:r>
     </w:p>
     <w:tbl>
@@ -14332,7 +14332,7 @@
                 <w:b/>
                 <w:sz w:val="20"/>
               </w:rPr>
-              <w:t>Variavel</w:t>
+              <w:t>Variável</w:t>
             </w:r>
           </w:p>
         </w:tc>
@@ -14372,7 +14372,7 @@
                 <w:b/>
                 <w:sz w:val="20"/>
               </w:rPr>
-              <w:t>Condicao</w:t>
+              <w:t>Condição</w:t>
             </w:r>
           </w:p>
         </w:tc>
@@ -14410,7 +14410,7 @@
                 <w:rFonts w:ascii="Times New Roman" w:hAnsi="Times New Roman"/>
                 <w:sz w:val="20"/>
               </w:rPr>
-              <w:t>Score &gt;= 30</w:t>
+              <w:t>Score ≥ 30</w:t>
             </w:r>
           </w:p>
         </w:tc>
@@ -14466,7 +14466,7 @@
                 <w:rFonts w:ascii="Times New Roman" w:hAnsi="Times New Roman"/>
                 <w:sz w:val="20"/>
               </w:rPr>
-              <w:t>Score &gt;= 60</w:t>
+              <w:t>Score ≥ 60</w:t>
             </w:r>
           </w:p>
         </w:tc>
@@ -14517,7 +14517,7 @@
           <w:b w:val="0"/>
           <w:sz w:val="24"/>
         </w:rPr>
-        <w:t>Restricao: S2 implica S1 (S2 -&gt; S1). Se o score e &gt;= 60, necessariamente e &gt;= 30. Portanto S2 . S1' = 0 (impossivel).</w:t>
+        <w:t>Restrição: S2 implica S1 (S2 → S1). Se o score é ≥ 60, necessariamente é ≥ 30. Portanto S2 · S1' = 0 (impossível).</w:t>
       </w:r>
     </w:p>
     <w:p>
@@ -14531,7 +14531,7 @@
           <w:i/>
           <w:sz w:val="20"/>
         </w:rPr>
-        <w:t>Quadro 12 - Saidas do Sistema de Classificacao</w:t>
+        <w:t>Quadro 12 — Saídas do Sistema de Classificação</w:t>
       </w:r>
     </w:p>
     <w:tbl>
@@ -14563,7 +14563,7 @@
                 <w:b/>
                 <w:sz w:val="20"/>
               </w:rPr>
-              <w:t>Saida</w:t>
+              <w:t>Saída</w:t>
             </w:r>
           </w:p>
         </w:tc>
@@ -14603,7 +14603,7 @@
                 <w:b/>
                 <w:sz w:val="20"/>
               </w:rPr>
-              <w:t>Condicao</w:t>
+              <w:t>Condição</w:t>
             </w:r>
           </w:p>
         </w:tc>
@@ -14715,7 +14715,7 @@
                 <w:rFonts w:ascii="Times New Roman" w:hAnsi="Times New Roman"/>
                 <w:sz w:val="20"/>
               </w:rPr>
-              <w:t>30 &lt;= Score &lt; 60</w:t>
+              <w:t>30 ≤ Score &lt; 60</w:t>
             </w:r>
           </w:p>
         </w:tc>
@@ -14771,7 +14771,7 @@
                 <w:rFonts w:ascii="Times New Roman" w:hAnsi="Times New Roman"/>
                 <w:sz w:val="20"/>
               </w:rPr>
-              <w:t>Score &gt;= 60</w:t>
+              <w:t>Score ≥ 60</w:t>
             </w:r>
           </w:p>
         </w:tc>
@@ -14803,7 +14803,7 @@
           <w:b/>
           <w:sz w:val="24"/>
         </w:rPr>
-        <w:t>Expressoes logicas originais:</w:t>
+        <w:t>Expressões lógicas originais:</w:t>
       </w:r>
     </w:p>
     <w:p>
@@ -14831,7 +14831,7 @@
           <w:b/>
           <w:sz w:val="22"/>
         </w:rPr>
-        <w:t>MO = S1 . S2'</w:t>
+        <w:t>MO = S1 · S2'</w:t>
       </w:r>
     </w:p>
     <w:p>
@@ -14845,7 +14845,7 @@
           <w:b/>
           <w:sz w:val="22"/>
         </w:rPr>
-        <w:t>LO = S1' . S2'</w:t>
+        <w:t>LO = S1' · S2'</w:t>
       </w:r>
     </w:p>
     <w:p>
@@ -14853,7 +14853,7 @@
         <w:pStyle w:val="Heading2"/>
       </w:pPr>
       <w:r>
-        <w:t>4.2  Simplificacao</w:t>
+        <w:t>4.2  Simplificação</w:t>
       </w:r>
     </w:p>
     <w:p>
@@ -14868,7 +14868,7 @@
           <w:b w:val="0"/>
           <w:sz w:val="24"/>
         </w:rPr>
-        <w:t>Observando que HI, MO e LO sao mutuamente exclusivos e exaustivos (exatamente uma classificacao e ativa por vez), podemos simplificar por substituicao de sinais:</w:t>
+        <w:t>Observando que HI, MO e LO são mutuamente exclusivos e exaustivos (exatamente uma classificação é ativa por vez), podemos simplificar por substituição de sinais:</w:t>
       </w:r>
     </w:p>
     <w:p>
@@ -14910,7 +14910,7 @@
           <w:b/>
           <w:sz w:val="22"/>
         </w:rPr>
-        <w:t>MO = S1 . HI'       [substituicao: S2' = HI']</w:t>
+        <w:t>MO = S1 · HI'       [substituição: S2' = HI']</w:t>
       </w:r>
     </w:p>
     <w:p>
@@ -14924,7 +14924,7 @@
           <w:b/>
           <w:sz w:val="22"/>
         </w:rPr>
-        <w:t>LO = (HI + MO)'     [derivacao por exclusao]</w:t>
+        <w:t>LO = (HI + MO)'     [derivação por exclusão]</w:t>
       </w:r>
     </w:p>
     <w:p>
@@ -14938,7 +14938,7 @@
           <w:b/>
           <w:sz w:val="24"/>
         </w:rPr>
-        <w:t>Prova da equivalencia para LO:</w:t>
+        <w:t>Prova da equivalência para LO:</w:t>
       </w:r>
     </w:p>
     <w:p>
@@ -14952,7 +14952,7 @@
           <w:b/>
           <w:sz w:val="22"/>
         </w:rPr>
-        <w:t>HI + MO = S2 + S1.S2'</w:t>
+        <w:t>HI + MO = S2 + S1·S2'</w:t>
       </w:r>
     </w:p>
     <w:p>
@@ -14966,7 +14966,7 @@
           <w:b/>
           <w:sz w:val="22"/>
         </w:rPr>
-        <w:t>= S2 + S1    [Absorcao: X + X'.Y = X + Y]</w:t>
+        <w:t>= S2 + S1    [Absorção: X + X'·Y = X + Y]</w:t>
       </w:r>
     </w:p>
     <w:p>
@@ -14980,7 +14980,7 @@
           <w:b/>
           <w:sz w:val="22"/>
         </w:rPr>
-        <w:t>LO = (S2 + S1)' = S1' . S2'    [Q.E.D.]</w:t>
+        <w:t>LO = (S2 + S1)' = S1' · S2'    [Q.E.D.]</w:t>
       </w:r>
     </w:p>
     <w:p>
@@ -14993,7 +14993,7 @@
         <w:pStyle w:val="Heading2"/>
       </w:pPr>
       <w:r>
-        <w:t>4.3  Prova de Equivalencia</w:t>
+        <w:t>4.3  Prova de Equivalência</w:t>
       </w:r>
     </w:p>
     <w:p>
@@ -15007,7 +15007,7 @@
           <w:i/>
           <w:sz w:val="20"/>
         </w:rPr>
-        <w:t>Quadro 13 - Tabela Verdade Comparativa: Sistema de Classificacao</w:t>
+        <w:t>Quadro 13 — Tabela Verdade Comparativa: Sistema de Classificação</w:t>
       </w:r>
     </w:p>
     <w:tbl>
@@ -15697,7 +15697,7 @@
                 <w:rFonts w:ascii="Times New Roman" w:hAnsi="Times New Roman"/>
                 <w:sz w:val="20"/>
               </w:rPr>
-              <w:t>Impossivel</w:t>
+              <w:t>Impossível</w:t>
             </w:r>
           </w:p>
         </w:tc>
@@ -15894,7 +15894,7 @@
           <w:b/>
           <w:sz w:val="24"/>
         </w:rPr>
-        <w:t>Resultado: Todas as saidas sao identicas nos 3 cenarios validos. Os modelos sao comprovadamente equivalentes.</w:t>
+        <w:t>Resultado: Todas as saídas são idênticas nos 3 cenários válidos. Os modelos são comprovadamente equivalentes.</w:t>
       </w:r>
     </w:p>
     <w:p>
@@ -15907,7 +15907,7 @@
         <w:pStyle w:val="Heading1"/>
       </w:pPr>
       <w:r>
-        <w:t>5  RESUMO DAS SIMPLIFICACOES</w:t>
+        <w:t>5  RESUMO DAS SIMPLIFICAÇÕES</w:t>
       </w:r>
     </w:p>
     <w:p>
@@ -15921,7 +15921,7 @@
           <w:i/>
           <w:sz w:val="20"/>
         </w:rPr>
-        <w:t>Quadro 14 - Resumo: Sistema de Alertas</w:t>
+        <w:t>Quadro 14 — Resumo: Sistema de Alertas</w:t>
       </w:r>
     </w:p>
     <w:tbl>
@@ -15954,7 +15954,7 @@
                 <w:b/>
                 <w:sz w:val="20"/>
               </w:rPr>
-              <w:t>Saida</w:t>
+              <w:t>Saída</w:t>
             </w:r>
           </w:p>
         </w:tc>
@@ -16014,7 +16014,7 @@
                 <w:b/>
                 <w:sz w:val="20"/>
               </w:rPr>
-              <w:t>Metodo</w:t>
+              <w:t>Método</w:t>
             </w:r>
           </w:p>
         </w:tc>
@@ -16088,7 +16088,7 @@
                 <w:rFonts w:ascii="Times New Roman" w:hAnsi="Times New Roman"/>
                 <w:sz w:val="20"/>
               </w:rPr>
-              <w:t>Ja minima</w:t>
+              <w:t>Já mínima</w:t>
             </w:r>
           </w:p>
         </w:tc>
@@ -16162,7 +16162,7 @@
                 <w:rFonts w:ascii="Times New Roman" w:hAnsi="Times New Roman"/>
                 <w:sz w:val="20"/>
               </w:rPr>
-              <w:t>Eliminacao redundancia</w:t>
+              <w:t>Eliminação redundância</w:t>
             </w:r>
           </w:p>
         </w:tc>
@@ -16200,7 +16200,7 @@
                 <w:rFonts w:ascii="Times New Roman" w:hAnsi="Times New Roman"/>
                 <w:sz w:val="20"/>
               </w:rPr>
-              <w:t>A'.C'.(B+D)</w:t>
+              <w:t>A'·C'·(B+D)</w:t>
             </w:r>
           </w:p>
         </w:tc>
@@ -16218,7 +16218,7 @@
                 <w:rFonts w:ascii="Times New Roman" w:hAnsi="Times New Roman"/>
                 <w:sz w:val="20"/>
               </w:rPr>
-              <w:t>R'.(B+D)</w:t>
+              <w:t>R'·(B+D)</w:t>
             </w:r>
           </w:p>
         </w:tc>
@@ -16274,7 +16274,7 @@
                 <w:rFonts w:ascii="Times New Roman" w:hAnsi="Times New Roman"/>
                 <w:sz w:val="20"/>
               </w:rPr>
-              <w:t>A'.B'.C'.D'</w:t>
+              <w:t>A'·B'·C'·D'</w:t>
             </w:r>
           </w:p>
         </w:tc>
@@ -16310,7 +16310,7 @@
                 <w:rFonts w:ascii="Times New Roman" w:hAnsi="Times New Roman"/>
                 <w:sz w:val="20"/>
               </w:rPr>
-              <w:t>Derivacao exclusao</w:t>
+              <w:t>Derivação exclusão</w:t>
             </w:r>
           </w:p>
         </w:tc>
@@ -16343,7 +16343,7 @@
           <w:b/>
           <w:sz w:val="24"/>
         </w:rPr>
-        <w:t>Economia no Sistema de Alertas: Reducao de 8 para 5 portas logicas (37,5%).</w:t>
+        <w:t>Economia no Sistema de Alertas: Redução de 8 para 5 portas lógicas (37,5%).</w:t>
       </w:r>
     </w:p>
     <w:p>
@@ -16357,7 +16357,7 @@
           <w:i/>
           <w:sz w:val="20"/>
         </w:rPr>
-        <w:t>Quadro 15 - Resumo: Sistema de Gamificacao</w:t>
+        <w:t>Quadro 15 — Resumo: Sistema de Gamificação</w:t>
       </w:r>
     </w:p>
     <w:tbl>
@@ -16390,7 +16390,7 @@
                 <w:b/>
                 <w:sz w:val="20"/>
               </w:rPr>
-              <w:t>Saida</w:t>
+              <w:t>Saída</w:t>
             </w:r>
           </w:p>
         </w:tc>
@@ -16450,7 +16450,7 @@
                 <w:b/>
                 <w:sz w:val="20"/>
               </w:rPr>
-              <w:t>Metodo</w:t>
+              <w:t>Método</w:t>
             </w:r>
           </w:p>
         </w:tc>
@@ -16524,7 +16524,7 @@
                 <w:rFonts w:ascii="Times New Roman" w:hAnsi="Times New Roman"/>
                 <w:sz w:val="20"/>
               </w:rPr>
-              <w:t>Absorcao (P3 sub P2)</w:t>
+              <w:t>Absorção (P3 ⊆ P2)</w:t>
             </w:r>
           </w:p>
         </w:tc>
@@ -16557,7 +16557,7 @@
           <w:b/>
           <w:sz w:val="24"/>
         </w:rPr>
-        <w:t>Economia no Sistema de Gamificacao: Reducao de 1 variavel de entrada (OR 5 -&gt; OR 4).</w:t>
+        <w:t>Economia no Sistema de Gamificação: Redução de 1 variável de entrada (OR 5 → OR 4).</w:t>
       </w:r>
     </w:p>
     <w:p>
@@ -16571,7 +16571,7 @@
           <w:i/>
           <w:sz w:val="20"/>
         </w:rPr>
-        <w:t>Quadro 16 - Resumo: Sistema de Classificacao de Risco</w:t>
+        <w:t>Quadro 16 — Resumo: Sistema de Classificação de Risco</w:t>
       </w:r>
     </w:p>
     <w:tbl>
@@ -16604,7 +16604,7 @@
                 <w:b/>
                 <w:sz w:val="20"/>
               </w:rPr>
-              <w:t>Saida</w:t>
+              <w:t>Saída</w:t>
             </w:r>
           </w:p>
         </w:tc>
@@ -16664,7 +16664,7 @@
                 <w:b/>
                 <w:sz w:val="20"/>
               </w:rPr>
-              <w:t>Metodo</w:t>
+              <w:t>Método</w:t>
             </w:r>
           </w:p>
         </w:tc>
@@ -16738,7 +16738,7 @@
                 <w:rFonts w:ascii="Times New Roman" w:hAnsi="Times New Roman"/>
                 <w:sz w:val="20"/>
               </w:rPr>
-              <w:t>Ja minima</w:t>
+              <w:t>Já mínima</w:t>
             </w:r>
           </w:p>
         </w:tc>
@@ -16776,7 +16776,7 @@
                 <w:rFonts w:ascii="Times New Roman" w:hAnsi="Times New Roman"/>
                 <w:sz w:val="20"/>
               </w:rPr>
-              <w:t>S1.S2'</w:t>
+              <w:t>S1·S2'</w:t>
             </w:r>
           </w:p>
         </w:tc>
@@ -16794,7 +16794,7 @@
                 <w:rFonts w:ascii="Times New Roman" w:hAnsi="Times New Roman"/>
                 <w:sz w:val="20"/>
               </w:rPr>
-              <w:t>S1.HI'</w:t>
+              <w:t>S1·HI'</w:t>
             </w:r>
           </w:p>
         </w:tc>
@@ -16850,7 +16850,7 @@
                 <w:rFonts w:ascii="Times New Roman" w:hAnsi="Times New Roman"/>
                 <w:sz w:val="20"/>
               </w:rPr>
-              <w:t>S1'.S2'</w:t>
+              <w:t>S1'·S2'</w:t>
             </w:r>
           </w:p>
         </w:tc>
@@ -16886,7 +16886,7 @@
                 <w:rFonts w:ascii="Times New Roman" w:hAnsi="Times New Roman"/>
                 <w:sz w:val="20"/>
               </w:rPr>
-              <w:t>Derivacao exclusao</w:t>
+              <w:t>Derivação exclusão</w:t>
             </w:r>
           </w:p>
         </w:tc>
@@ -16919,7 +16919,7 @@
           <w:b/>
           <w:sz w:val="24"/>
         </w:rPr>
-        <w:t>Economia no Sistema de Classificacao: Reutilizacao de sinais ja calculados, eliminando portas NOT duplicadas.</w:t>
+        <w:t>Economia no Sistema de Classificação: Reutilização de sinais já calculados, eliminando portas NOT duplicadas.</w:t>
       </w:r>
     </w:p>
     <w:p>
@@ -16932,7 +16932,7 @@
         <w:pStyle w:val="Heading1"/>
       </w:pPr>
       <w:r>
-        <w:t>6  CONCLUSAO</w:t>
+        <w:t>6  CONCLUSÃO</w:t>
       </w:r>
     </w:p>
     <w:p>
@@ -16947,7 +16947,7 @@
           <w:b w:val="0"/>
           <w:sz w:val="24"/>
         </w:rPr>
-        <w:t>Este relatorio demonstrou a modelagem completa da logica digital do projeto Level UP em tres subsistemas distintos. Para cada subsistema, o trabalho foi conduzido em tres etapas rigorosas, conforme solicitado no enunciado da Sprint 03.</w:t>
+        <w:t>Este relatório demonstrou a modelagem completa da lógica digital do projeto Level UP em três subsistemas distintos. Para cada subsistema, o trabalho foi conduzido em três etapas rigorosas, conforme solicitado no enunciado da Sprint 03.</w:t>
       </w:r>
     </w:p>
     <w:p>
@@ -16962,7 +16962,7 @@
           <w:b w:val="0"/>
           <w:sz w:val="24"/>
         </w:rPr>
-        <w:t>Na primeira etapa, modelamos as expressoes booleanas originais, extraindo-as diretamente do codigo-fonte (sketch.ino) das funcoes evaluateHealth(), awardPoints() e calculateRiskScore(). Cada variavel de entrada foi cuidadosamente definida a partir das condicoes logicas presentes no codigo, e as restricoes de exclusao mutua foram identificadas e formalizadas.</w:t>
+        <w:t>Na primeira etapa, modelamos as expressões booleanas originais, extraindo-as diretamente do código-fonte (sketch.ino) das funções evaluateHealth(), awardPoints() e calculateRiskScore(). Cada variável de entrada foi cuidadosamente definida a partir das condições lógicas presentes no código, e as restrições de exclusão mútua foram identificadas e formalizadas.</w:t>
       </w:r>
     </w:p>
     <w:p>
@@ -16977,7 +16977,7 @@
           <w:b w:val="0"/>
           <w:sz w:val="24"/>
         </w:rPr>
-        <w:t>Na segunda etapa, aplicamos tecnicas de simplificacao utilizando algebra booleana (Leis de De Morgan, Teorema da Absorcao, eliminacao de redundancia) e mapas de Karnaugh com condicoes don't care. As simplificacoes resultaram em reducoes significativas: 37,5% menos portas logicas no sistema de alertas, eliminacao de variavel redundante no sistema de gamificacao, e reutilizacao eficiente de sinais no sistema de classificacao de risco.</w:t>
+        <w:t>Na segunda etapa, aplicamos técnicas de simplificação utilizando álgebra booleana (Leis de De Morgan, Teorema da Absorção, eliminação de redundância) e mapas de Karnaugh com condições don't care. As simplificações resultaram em reduções significativas: 37,5% menos portas lógicas no sistema de alertas, eliminação de variável redundante no sistema de gamificação, e reutilização eficiente de sinais no sistema de classificação de risco.</w:t>
       </w:r>
     </w:p>
     <w:p>
@@ -16992,7 +16992,7 @@
           <w:b w:val="0"/>
           <w:sz w:val="24"/>
         </w:rPr>
-        <w:t>Na terceira etapa, provamos a equivalencia entre os modelos original e simplificado por meio de tabelas verdade comparativas. Em todos os cenarios validos de todos os tres subsistemas, as saidas dos modelos original e simplificado sao identicas, confirmando matematicamente a correcao das simplificacoes realizadas.</w:t>
+        <w:t>Na terceira etapa, provamos a equivalência entre os modelos original e simplificado por meio de tabelas verdade comparativas. Em todos os cenários válidos de todos os três subsistemas, as saídas dos modelos original e simplificado são idênticas, confirmando matematicamente a correção das simplificações realizadas.</w:t>
       </w:r>
     </w:p>
     <w:p>
@@ -17007,7 +17007,7 @@
           <w:b w:val="0"/>
           <w:sz w:val="24"/>
         </w:rPr>
-        <w:t>Essas otimizacoes sao aplicaveis tanto em implementacao com portas logicas discretas (circuitos digitais) quanto no firmware embarcado do ESP32, contribuindo para menor consumo de energia, menor latencia de processamento e maior eficiencia computacional do sistema Level UP.</w:t>
+        <w:t>Essas otimizações são aplicáveis tanto em implementação com portas lógicas discretas (circuitos digitais) quanto no firmware embarcado do ESP32, contribuindo para menor consumo de energia, menor latência de processamento e maior eficiência computacional do sistema Level UP.</w:t>
       </w:r>
     </w:p>
     <w:p>
@@ -17026,39 +17026,36 @@
           <w:b/>
           <w:sz w:val="28"/>
         </w:rPr>
-        <w:t>REFERENCIAS</w:t>
+        <w:t>REFERÊNCIAS</w:t>
       </w:r>
     </w:p>
     <w:p>
       <w:pPr>
         <w:spacing w:after="240" w:line="240" w:lineRule="auto"/>
-        <w:ind w:left="0"/>
       </w:pPr>
       <w:r>
         <w:rPr>
           <w:rFonts w:ascii="Times New Roman" w:hAnsi="Times New Roman"/>
           <w:sz w:val="24"/>
         </w:rPr>
-        <w:t>FLOYD, Thomas L. Sistemas digitais: fundamentos e aplicacoes. 9. ed. Porto Alegre: Bookman, 2007.</w:t>
+        <w:t>FLOYD, Thomas L. Sistemas digitais: fundamentos e aplicações. 9. ed. Porto Alegre: Bookman, 2007.</w:t>
       </w:r>
     </w:p>
     <w:p>
       <w:pPr>
         <w:spacing w:after="240" w:line="240" w:lineRule="auto"/>
-        <w:ind w:left="0"/>
       </w:pPr>
       <w:r>
         <w:rPr>
           <w:rFonts w:ascii="Times New Roman" w:hAnsi="Times New Roman"/>
           <w:sz w:val="24"/>
         </w:rPr>
-        <w:t>IDOETA, Ivan V.; CAPUANO, Francisco G. Elementos de eletronica digital. 42. ed. Sao Paulo: Erica, 2019.</w:t>
+        <w:t>IDOETA, Ivan V.; CAPUANO, Francisco G. Elementos de eletrônica digital. 42. ed. São Paulo: Érica, 2019.</w:t>
       </w:r>
     </w:p>
     <w:p>
       <w:pPr>
         <w:spacing w:after="240" w:line="240" w:lineRule="auto"/>
-        <w:ind w:left="0"/>
       </w:pPr>
       <w:r>
         <w:rPr>
@@ -17071,53 +17068,49 @@
     <w:p>
       <w:pPr>
         <w:spacing w:after="240" w:line="240" w:lineRule="auto"/>
-        <w:ind w:left="0"/>
       </w:pPr>
       <w:r>
         <w:rPr>
           <w:rFonts w:ascii="Times New Roman" w:hAnsi="Times New Roman"/>
           <w:sz w:val="24"/>
         </w:rPr>
-        <w:t>TOCCI, Ronald J.; WIDMER, Neal S.; MOSS, Gregory L. Sistemas digitais: principios e aplicacoes. 12. ed. Sao Paulo: Pearson Education, 2018.</w:t>
+        <w:t>TOCCI, Ronald J.; WIDMER, Neal S.; MOSS, Gregory L. Sistemas digitais: princípios e aplicações. 12. ed. São Paulo: Pearson Education, 2018.</w:t>
       </w:r>
     </w:p>
     <w:p>
       <w:pPr>
         <w:spacing w:after="240" w:line="240" w:lineRule="auto"/>
-        <w:ind w:left="0"/>
       </w:pPr>
       <w:r>
         <w:rPr>
           <w:rFonts w:ascii="Times New Roman" w:hAnsi="Times New Roman"/>
           <w:sz w:val="24"/>
         </w:rPr>
-        <w:t>ESPRESSIF SYSTEMS. ESP32 Technical Reference Manual. Version 5.0. Shanghai: Espressif Systems, 2024. Disponivel em: https://www.espressif.com/sites/default/files/documentation/esp32_technical_reference_manual_en.pdf. Acesso em: 10 maio 2025.</w:t>
+        <w:t>ESPRESSIF SYSTEMS. ESP32 Technical Reference Manual. Version 5.0. Shanghai: Espressif Systems, 2024. Disponível em: https://www.espressif.com/sites/default/files/documentation/esp32_technical_reference_manual_en.pdf. Acesso em: 10 maio 2025.</w:t>
       </w:r>
     </w:p>
     <w:p>
       <w:pPr>
         <w:spacing w:after="240" w:line="240" w:lineRule="auto"/>
-        <w:ind w:left="0"/>
       </w:pPr>
       <w:r>
         <w:rPr>
           <w:rFonts w:ascii="Times New Roman" w:hAnsi="Times New Roman"/>
           <w:sz w:val="24"/>
         </w:rPr>
-        <w:t>ARDUINO. Arduino Language Reference. Disponivel em: https://www.arduino.cc/reference/en/. Acesso em: 10 maio 2025.</w:t>
+        <w:t>ARDUINO. Arduino Language Reference. Disponível em: https://www.arduino.cc/reference/en/. Acesso em: 10 maio 2025.</w:t>
       </w:r>
     </w:p>
     <w:p>
       <w:pPr>
         <w:spacing w:after="240" w:line="240" w:lineRule="auto"/>
-        <w:ind w:left="0"/>
       </w:pPr>
       <w:r>
         <w:rPr>
           <w:rFonts w:ascii="Times New Roman" w:hAnsi="Times New Roman"/>
           <w:sz w:val="24"/>
         </w:rPr>
-        <w:t>WOKWI. Wokwi ESP32 Simulator Documentation. Disponivel em: https://docs.wokwi.com/. Acesso em: 10 maio 2025.</w:t>
+        <w:t>WOKWI. Wokwi ESP32 Simulator Documentation. Disponível em: https://docs.wokwi.com/. Acesso em: 10 maio 2025.</w:t>
       </w:r>
     </w:p>
     <w:sectPr>

</xml_diff>